<commit_message>
swagger documentation & dockerization
</commit_message>
<xml_diff>
--- a/actuator1.docx
+++ b/actuator1.docx
@@ -40,6 +40,9 @@
     <w:p/>
     <w:p>
       <w:r>
+        <w:rPr>
+          <w:noProof/>
+        </w:rPr>
         <w:drawing>
           <wp:inline distT="0" distB="0" distL="0" distR="0" wp14:anchorId="111245E6" wp14:editId="0CCAEE84">
             <wp:extent cx="5943600" cy="2616835"/>
@@ -2308,6 +2311,7 @@
   <w:style w:type="character" w:default="1" w:styleId="DefaultParagraphFont">
     <w:name w:val="Default Paragraph Font"/>
     <w:uiPriority w:val="1"/>
+    <w:semiHidden/>
     <w:unhideWhenUsed/>
   </w:style>
   <w:style w:type="table" w:default="1" w:styleId="TableNormal">

</xml_diff>